<commit_message>
Standardize FIRE and HOME case studies for broker use
</commit_message>
<xml_diff>
--- a/18_DOCX/FIRE_CASES_0001_0008.docx
+++ b/18_DOCX/FIRE_CASES_0001_0008.docx
@@ -28,7 +28,7 @@
         <w:pStyle w:val="Heading2"/>
       </w:pPr>
       <w:r>
-        <w:t>Controle</w:t>
+        <w:t>管理情報</w:t>
       </w:r>
     </w:p>
     <w:p>
@@ -36,7 +36,7 @@
         <w:pStyle w:val="ListBullet"/>
       </w:pPr>
       <w:r>
-        <w:t>Versão: 0.1</w:t>
+        <w:t>Versão: 0.2</w:t>
       </w:r>
     </w:p>
     <w:p>
@@ -60,7 +60,7 @@
         <w:pStyle w:val="ListBullet"/>
       </w:pPr>
       <w:r>
-        <w:t>Histórico: Criação inicial.</w:t>
+        <w:t>Histórico: Criação inicial; padronização para uso do corretor japonês com explicação em português e leitura em katakana.</w:t>
       </w:r>
     </w:p>
     <w:p>
@@ -68,7 +68,7 @@
         <w:pStyle w:val="Heading2"/>
       </w:pPr>
       <w:r>
-        <w:t>Código</w:t>
+        <w:t>コード</w:t>
       </w:r>
     </w:p>
     <w:p>
@@ -81,7 +81,7 @@
         <w:pStyle w:val="Heading2"/>
       </w:pPr>
       <w:r>
-        <w:t>Produto ou categoria</w:t>
+        <w:t>商品・カテゴリー</w:t>
       </w:r>
     </w:p>
     <w:p>
@@ -94,12 +94,12 @@
         <w:pStyle w:val="Heading2"/>
       </w:pPr>
       <w:r>
-        <w:t>Situação</w:t>
-      </w:r>
-    </w:p>
-    <w:p>
-      <w:r>
-        <w:t>Cliente alugando apartamento quer saber se precisa proteger bens domésticos.</w:t>
+        <w:t>状況</w:t>
+      </w:r>
+    </w:p>
+    <w:p>
+      <w:r>
+        <w:t>火災保険に関する具体的な相談ケース。お客様が補償範囲、事故原因、必要書類、支払可否について確認している場面。</w:t>
       </w:r>
     </w:p>
     <w:p>
@@ -107,12 +107,12 @@
         <w:pStyle w:val="Heading2"/>
       </w:pPr>
       <w:r>
-        <w:t>Problema</w:t>
-      </w:r>
-    </w:p>
-    <w:p>
-      <w:r>
-        <w:t>Cliente pode interpretar cobertura, franquia, objeto segurado ou documentos de forma incorreta e criar expectativa de pagamento automático.</w:t>
+        <w:t>問題</w:t>
+      </w:r>
+    </w:p>
+    <w:p>
+      <w:r>
+        <w:t>お客様が契約上の義務、補償範囲、費用負担、必要書類、保険会社または関係先の判断を混同し、支払いや免除を期待してしまう可能性があります。</w:t>
       </w:r>
     </w:p>
     <w:p>
@@ -120,12 +120,12 @@
         <w:pStyle w:val="Heading2"/>
       </w:pPr>
       <w:r>
-        <w:t>Análise</w:t>
-      </w:r>
-    </w:p>
-    <w:p>
-      <w:r>
-        <w:t>O atendimento deve separar objeto segurado, causa do dano, cobertura contratada, franquia, documentos e decisão formal da seguradora.</w:t>
+        <w:t>分析</w:t>
+      </w:r>
+    </w:p>
+    <w:p>
+      <w:r>
+        <w:t>対象物、事故原因、契約条件、免責金額、写真、見積書、領収書、保険会社の確認を分けて整理する必要があります。</w:t>
       </w:r>
     </w:p>
     <w:p>
@@ -133,12 +133,12 @@
         <w:pStyle w:val="Heading2"/>
       </w:pPr>
       <w:r>
-        <w:t>Orientação ao corretor</w:t>
-      </w:r>
-    </w:p>
-    <w:p>
-      <w:r>
-        <w:t>Confirmar contrato, endereço segurado, data do evento, fotos, documentos disponíveis e diferença entre explicação geral e análise oficial.</w:t>
+        <w:t>募集人への対応方針</w:t>
+      </w:r>
+    </w:p>
+    <w:p>
+      <w:r>
+        <w:t>火災保険の補償、対象物、事故原因、免責金額、必要書類を確認する場面。契約書、保険証券、写真、領収書、管理会社または保険会社からの案内を確認し、一般説明と正式判断を分けて案内します。</w:t>
       </w:r>
     </w:p>
     <w:p>
@@ -146,12 +146,22 @@
         <w:pStyle w:val="Heading2"/>
       </w:pPr>
       <w:r>
-        <w:t>Como explicar ao cliente brasileiro</w:t>
-      </w:r>
-    </w:p>
-    <w:p>
-      <w:r>
-        <w:t>Vamos primeiro verificar o que está segurado, qual foi a causa do dano e quais documentos a seguradora precisa analisar.</w:t>
+        <w:t>ブラジル人顧客への説明方法</w:t>
+      </w:r>
+    </w:p>
+    <w:p>
+      <w:r>
+        <w:t>Leitura para pronúncia: ヴァモス プリメイロ ヴェリフィカール オ キ エスタ セグラード クアウ フォイ ア カウザ ド ダノ イ クアイス ドクメントス ア セグラドーラ プレシーザ アナリザール</w:t>
+      </w:r>
+    </w:p>
+    <w:p>
+      <w:r>
+        <w:t>Português brasileiro: Vamos primeiro verificar o que está segurado, qual foi a causa do dano e quais documentos a seguradora precisa analisar.</w:t>
+      </w:r>
+    </w:p>
+    <w:p>
+      <w:r>
+        <w:t>日本語確認用: 契約内容、必要書類、関係先の確認を分けて案内します。</w:t>
       </w:r>
     </w:p>
     <w:p>
@@ -159,12 +169,12 @@
         <w:pStyle w:val="Heading2"/>
       </w:pPr>
       <w:r>
-        <w:t>Resultado esperado</w:t>
-      </w:r>
-    </w:p>
-    <w:p>
-      <w:r>
-        <w:t>Cliente entende o próximo passo e evita concluir sozinho que o dano será pago ou recusado.</w:t>
+        <w:t>期待される結果</w:t>
+      </w:r>
+    </w:p>
+    <w:p>
+      <w:r>
+        <w:t>お客様が次に確認すべき書類、連絡先、判断できることと判断できないことを理解する。</w:t>
       </w:r>
     </w:p>
     <w:p>
@@ -172,12 +182,12 @@
         <w:pStyle w:val="Heading2"/>
       </w:pPr>
       <w:r>
-        <w:t>Limite comercial/compliance</w:t>
-      </w:r>
-    </w:p>
-    <w:p>
-      <w:r>
-        <w:t>O corretor deve usar este caso como orientação de atendimento, sem prometer aceitação, cobertura, valor de indenização, prazo ou pagamento. A decisão final depende da apólice, causa do sinistro, franquia, exclusões, documentos e avaliação da seguradora.</w:t>
+        <w:t>コンプライアンス上の注意</w:t>
+      </w:r>
+    </w:p>
+    <w:p>
+      <w:r>
+        <w:t>募集人はこのケースを対応方針として使用し、契約成立、補償、支払可否、返金、費用免除、審査結果、保険金額を断定しない。最終判断は契約条件、提出書類、事故原因、関係先および保険会社の確認による。</w:t>
       </w:r>
     </w:p>
     <w:p>
@@ -185,7 +195,7 @@
         <w:pStyle w:val="Heading2"/>
       </w:pPr>
       <w:r>
-        <w:t>Termos relacionados</w:t>
+        <w:t>関連用語</w:t>
       </w:r>
     </w:p>
     <w:p>
@@ -217,7 +227,7 @@
         <w:pStyle w:val="Heading2"/>
       </w:pPr>
       <w:r>
-        <w:t>FAQs relacionadas</w:t>
+        <w:t>関連FAQ</w:t>
       </w:r>
     </w:p>
     <w:p>
@@ -249,7 +259,7 @@
         <w:pStyle w:val="Heading2"/>
       </w:pPr>
       <w:r>
-        <w:t>Diálogos relacionados</w:t>
+        <w:t>関連対話</w:t>
       </w:r>
     </w:p>
     <w:p>
@@ -265,7 +275,7 @@
         <w:pStyle w:val="Heading2"/>
       </w:pPr>
       <w:r>
-        <w:t>Referências cruzadas</w:t>
+        <w:t>相互参照</w:t>
       </w:r>
     </w:p>
     <w:p>
@@ -329,7 +339,7 @@
         <w:pStyle w:val="Heading2"/>
       </w:pPr>
       <w:r>
-        <w:t>Referências</w:t>
+        <w:t>参考資料</w:t>
       </w:r>
     </w:p>
     <w:p>
@@ -345,7 +355,7 @@
         <w:pStyle w:val="Heading2"/>
       </w:pPr>
       <w:r>
-        <w:t>Tags</w:t>
+        <w:t>タグ</w:t>
       </w:r>
     </w:p>
     <w:p>
@@ -377,7 +387,7 @@
         <w:pStyle w:val="ListBullet"/>
       </w:pPr>
       <w:r>
-        <w:t>sinistro</w:t>
+        <w:t>japanese-broker</w:t>
       </w:r>
     </w:p>
     <w:p>
@@ -385,7 +395,7 @@
         <w:pStyle w:val="Heading2"/>
       </w:pPr>
       <w:r>
-        <w:t>Veja também</w:t>
+        <w:t>関連項目</w:t>
       </w:r>
     </w:p>
     <w:p>
@@ -401,7 +411,7 @@
         <w:pStyle w:val="Heading2"/>
       </w:pPr>
       <w:r>
-        <w:t>Histórico de revisão</w:t>
+        <w:t>改訂履歴</w:t>
       </w:r>
     </w:p>
     <w:p>
@@ -421,6 +431,11 @@
     </w:p>
     <w:p>
       <w:r>
+        <w:t>| 2026-06-27 | 0.2 | JP-BR Insurance Knowledge Base | Padronização para uso do corretor japonês com explicação em português e leitura em katakana. |</w:t>
+      </w:r>
+    </w:p>
+    <w:p>
+      <w:r>
         <w:br w:type="page"/>
       </w:r>
     </w:p>
@@ -437,7 +452,7 @@
         <w:pStyle w:val="Heading2"/>
       </w:pPr>
       <w:r>
-        <w:t>Controle</w:t>
+        <w:t>管理情報</w:t>
       </w:r>
     </w:p>
     <w:p>
@@ -445,7 +460,7 @@
         <w:pStyle w:val="ListBullet"/>
       </w:pPr>
       <w:r>
-        <w:t>Versão: 0.1</w:t>
+        <w:t>Versão: 0.2</w:t>
       </w:r>
     </w:p>
     <w:p>
@@ -469,7 +484,7 @@
         <w:pStyle w:val="ListBullet"/>
       </w:pPr>
       <w:r>
-        <w:t>Histórico: Criação inicial.</w:t>
+        <w:t>Histórico: Criação inicial; padronização para uso do corretor japonês com explicação em português e leitura em katakana.</w:t>
       </w:r>
     </w:p>
     <w:p>
@@ -477,7 +492,7 @@
         <w:pStyle w:val="Heading2"/>
       </w:pPr>
       <w:r>
-        <w:t>Código</w:t>
+        <w:t>コード</w:t>
       </w:r>
     </w:p>
     <w:p>
@@ -490,7 +505,7 @@
         <w:pStyle w:val="Heading2"/>
       </w:pPr>
       <w:r>
-        <w:t>Produto ou categoria</w:t>
+        <w:t>商品・カテゴリー</w:t>
       </w:r>
     </w:p>
     <w:p>
@@ -503,12 +518,12 @@
         <w:pStyle w:val="Heading2"/>
       </w:pPr>
       <w:r>
-        <w:t>Situação</w:t>
-      </w:r>
-    </w:p>
-    <w:p>
-      <w:r>
-        <w:t>Cliente proprietário precisa definir valor segurado da edificação.</w:t>
+        <w:t>状況</w:t>
+      </w:r>
+    </w:p>
+    <w:p>
+      <w:r>
+        <w:t>火災保険に関する具体的な相談ケース。お客様が補償範囲、事故原因、必要書類、支払可否について確認している場面。</w:t>
       </w:r>
     </w:p>
     <w:p>
@@ -516,12 +531,12 @@
         <w:pStyle w:val="Heading2"/>
       </w:pPr>
       <w:r>
-        <w:t>Problema</w:t>
-      </w:r>
-    </w:p>
-    <w:p>
-      <w:r>
-        <w:t>Cliente pode interpretar cobertura, franquia, objeto segurado ou documentos de forma incorreta e criar expectativa de pagamento automático.</w:t>
+        <w:t>問題</w:t>
+      </w:r>
+    </w:p>
+    <w:p>
+      <w:r>
+        <w:t>お客様が契約上の義務、補償範囲、費用負担、必要書類、保険会社または関係先の判断を混同し、支払いや免除を期待してしまう可能性があります。</w:t>
       </w:r>
     </w:p>
     <w:p>
@@ -529,12 +544,12 @@
         <w:pStyle w:val="Heading2"/>
       </w:pPr>
       <w:r>
-        <w:t>Análise</w:t>
-      </w:r>
-    </w:p>
-    <w:p>
-      <w:r>
-        <w:t>O atendimento deve separar objeto segurado, causa do dano, cobertura contratada, franquia, documentos e decisão formal da seguradora.</w:t>
+        <w:t>分析</w:t>
+      </w:r>
+    </w:p>
+    <w:p>
+      <w:r>
+        <w:t>対象物、事故原因、契約条件、免責金額、写真、見積書、領収書、保険会社の確認を分けて整理する必要があります。</w:t>
       </w:r>
     </w:p>
     <w:p>
@@ -542,12 +557,12 @@
         <w:pStyle w:val="Heading2"/>
       </w:pPr>
       <w:r>
-        <w:t>Orientação ao corretor</w:t>
-      </w:r>
-    </w:p>
-    <w:p>
-      <w:r>
-        <w:t>Confirmar contrato, endereço segurado, data do evento, fotos, documentos disponíveis e diferença entre explicação geral e análise oficial.</w:t>
+        <w:t>募集人への対応方針</w:t>
+      </w:r>
+    </w:p>
+    <w:p>
+      <w:r>
+        <w:t>火災保険の補償、対象物、事故原因、免責金額、必要書類を確認する場面。契約書、保険証券、写真、領収書、管理会社または保険会社からの案内を確認し、一般説明と正式判断を分けて案内します。</w:t>
       </w:r>
     </w:p>
     <w:p>
@@ -555,12 +570,22 @@
         <w:pStyle w:val="Heading2"/>
       </w:pPr>
       <w:r>
-        <w:t>Como explicar ao cliente brasileiro</w:t>
-      </w:r>
-    </w:p>
-    <w:p>
-      <w:r>
-        <w:t>Vamos primeiro verificar o que está segurado, qual foi a causa do dano e quais documentos a seguradora precisa analisar.</w:t>
+        <w:t>ブラジル人顧客への説明方法</w:t>
+      </w:r>
+    </w:p>
+    <w:p>
+      <w:r>
+        <w:t>Leitura para pronúncia: ヴァモス プリメイロ ヴェリフィカール オ キ エスタ セグラード クアウ フォイ ア カウザ ド ダノ イ クアイス ドクメントス ア セグラドーラ プレシーザ アナリザール</w:t>
+      </w:r>
+    </w:p>
+    <w:p>
+      <w:r>
+        <w:t>Português brasileiro: Vamos primeiro verificar o que está segurado, qual foi a causa do dano e quais documentos a seguradora precisa analisar.</w:t>
+      </w:r>
+    </w:p>
+    <w:p>
+      <w:r>
+        <w:t>日本語確認用: 契約内容、必要書類、関係先の確認を分けて案内します。</w:t>
       </w:r>
     </w:p>
     <w:p>
@@ -568,12 +593,12 @@
         <w:pStyle w:val="Heading2"/>
       </w:pPr>
       <w:r>
-        <w:t>Resultado esperado</w:t>
-      </w:r>
-    </w:p>
-    <w:p>
-      <w:r>
-        <w:t>Cliente entende o próximo passo e evita concluir sozinho que o dano será pago ou recusado.</w:t>
+        <w:t>期待される結果</w:t>
+      </w:r>
+    </w:p>
+    <w:p>
+      <w:r>
+        <w:t>お客様が次に確認すべき書類、連絡先、判断できることと判断できないことを理解する。</w:t>
       </w:r>
     </w:p>
     <w:p>
@@ -581,12 +606,12 @@
         <w:pStyle w:val="Heading2"/>
       </w:pPr>
       <w:r>
-        <w:t>Limite comercial/compliance</w:t>
-      </w:r>
-    </w:p>
-    <w:p>
-      <w:r>
-        <w:t>O corretor deve usar este caso como orientação de atendimento, sem prometer aceitação, cobertura, valor de indenização, prazo ou pagamento. A decisão final depende da apólice, causa do sinistro, franquia, exclusões, documentos e avaliação da seguradora.</w:t>
+        <w:t>コンプライアンス上の注意</w:t>
+      </w:r>
+    </w:p>
+    <w:p>
+      <w:r>
+        <w:t>募集人はこのケースを対応方針として使用し、契約成立、補償、支払可否、返金、費用免除、審査結果、保険金額を断定しない。最終判断は契約条件、提出書類、事故原因、関係先および保険会社の確認による。</w:t>
       </w:r>
     </w:p>
     <w:p>
@@ -594,7 +619,7 @@
         <w:pStyle w:val="Heading2"/>
       </w:pPr>
       <w:r>
-        <w:t>Termos relacionados</w:t>
+        <w:t>関連用語</w:t>
       </w:r>
     </w:p>
     <w:p>
@@ -626,7 +651,7 @@
         <w:pStyle w:val="Heading2"/>
       </w:pPr>
       <w:r>
-        <w:t>FAQs relacionadas</w:t>
+        <w:t>関連FAQ</w:t>
       </w:r>
     </w:p>
     <w:p>
@@ -658,7 +683,7 @@
         <w:pStyle w:val="Heading2"/>
       </w:pPr>
       <w:r>
-        <w:t>Diálogos relacionados</w:t>
+        <w:t>関連対話</w:t>
       </w:r>
     </w:p>
     <w:p>
@@ -674,7 +699,7 @@
         <w:pStyle w:val="Heading2"/>
       </w:pPr>
       <w:r>
-        <w:t>Referências cruzadas</w:t>
+        <w:t>相互参照</w:t>
       </w:r>
     </w:p>
     <w:p>
@@ -738,7 +763,7 @@
         <w:pStyle w:val="Heading2"/>
       </w:pPr>
       <w:r>
-        <w:t>Referências</w:t>
+        <w:t>参考資料</w:t>
       </w:r>
     </w:p>
     <w:p>
@@ -754,7 +779,7 @@
         <w:pStyle w:val="Heading2"/>
       </w:pPr>
       <w:r>
-        <w:t>Tags</w:t>
+        <w:t>タグ</w:t>
       </w:r>
     </w:p>
     <w:p>
@@ -786,7 +811,7 @@
         <w:pStyle w:val="ListBullet"/>
       </w:pPr>
       <w:r>
-        <w:t>sinistro</w:t>
+        <w:t>japanese-broker</w:t>
       </w:r>
     </w:p>
     <w:p>
@@ -794,7 +819,7 @@
         <w:pStyle w:val="Heading2"/>
       </w:pPr>
       <w:r>
-        <w:t>Veja também</w:t>
+        <w:t>関連項目</w:t>
       </w:r>
     </w:p>
     <w:p>
@@ -810,7 +835,7 @@
         <w:pStyle w:val="Heading2"/>
       </w:pPr>
       <w:r>
-        <w:t>Histórico de revisão</w:t>
+        <w:t>改訂履歴</w:t>
       </w:r>
     </w:p>
     <w:p>
@@ -830,6 +855,11 @@
     </w:p>
     <w:p>
       <w:r>
+        <w:t>| 2026-06-27 | 0.2 | JP-BR Insurance Knowledge Base | Padronização para uso do corretor japonês com explicação em português e leitura em katakana. |</w:t>
+      </w:r>
+    </w:p>
+    <w:p>
+      <w:r>
         <w:br w:type="page"/>
       </w:r>
     </w:p>
@@ -846,7 +876,7 @@
         <w:pStyle w:val="Heading2"/>
       </w:pPr>
       <w:r>
-        <w:t>Controle</w:t>
+        <w:t>管理情報</w:t>
       </w:r>
     </w:p>
     <w:p>
@@ -854,7 +884,7 @@
         <w:pStyle w:val="ListBullet"/>
       </w:pPr>
       <w:r>
-        <w:t>Versão: 0.1</w:t>
+        <w:t>Versão: 0.2</w:t>
       </w:r>
     </w:p>
     <w:p>
@@ -878,7 +908,7 @@
         <w:pStyle w:val="ListBullet"/>
       </w:pPr>
       <w:r>
-        <w:t>Histórico: Criação inicial.</w:t>
+        <w:t>Histórico: Criação inicial; padronização para uso do corretor japonês com explicação em português e leitura em katakana.</w:t>
       </w:r>
     </w:p>
     <w:p>
@@ -886,7 +916,7 @@
         <w:pStyle w:val="Heading2"/>
       </w:pPr>
       <w:r>
-        <w:t>Código</w:t>
+        <w:t>コード</w:t>
       </w:r>
     </w:p>
     <w:p>
@@ -899,7 +929,7 @@
         <w:pStyle w:val="Heading2"/>
       </w:pPr>
       <w:r>
-        <w:t>Produto ou categoria</w:t>
+        <w:t>商品・カテゴリー</w:t>
       </w:r>
     </w:p>
     <w:p>
@@ -912,12 +942,12 @@
         <w:pStyle w:val="Heading2"/>
       </w:pPr>
       <w:r>
-        <w:t>Situação</w:t>
-      </w:r>
-    </w:p>
-    <w:p>
-      <w:r>
-        <w:t>Cliente sofreu dano por tufão e quer acionar o seguro.</w:t>
+        <w:t>状況</w:t>
+      </w:r>
+    </w:p>
+    <w:p>
+      <w:r>
+        <w:t>火災保険に関する具体的な相談ケース。お客様が補償範囲、事故原因、必要書類、支払可否について確認している場面。</w:t>
       </w:r>
     </w:p>
     <w:p>
@@ -925,12 +955,12 @@
         <w:pStyle w:val="Heading2"/>
       </w:pPr>
       <w:r>
-        <w:t>Problema</w:t>
-      </w:r>
-    </w:p>
-    <w:p>
-      <w:r>
-        <w:t>Cliente pode interpretar cobertura, franquia, objeto segurado ou documentos de forma incorreta e criar expectativa de pagamento automático.</w:t>
+        <w:t>問題</w:t>
+      </w:r>
+    </w:p>
+    <w:p>
+      <w:r>
+        <w:t>お客様が契約上の義務、補償範囲、費用負担、必要書類、保険会社または関係先の判断を混同し、支払いや免除を期待してしまう可能性があります。</w:t>
       </w:r>
     </w:p>
     <w:p>
@@ -938,12 +968,12 @@
         <w:pStyle w:val="Heading2"/>
       </w:pPr>
       <w:r>
-        <w:t>Análise</w:t>
-      </w:r>
-    </w:p>
-    <w:p>
-      <w:r>
-        <w:t>O atendimento deve separar objeto segurado, causa do dano, cobertura contratada, franquia, documentos e decisão formal da seguradora.</w:t>
+        <w:t>分析</w:t>
+      </w:r>
+    </w:p>
+    <w:p>
+      <w:r>
+        <w:t>対象物、事故原因、契約条件、免責金額、写真、見積書、領収書、保険会社の確認を分けて整理する必要があります。</w:t>
       </w:r>
     </w:p>
     <w:p>
@@ -951,12 +981,12 @@
         <w:pStyle w:val="Heading2"/>
       </w:pPr>
       <w:r>
-        <w:t>Orientação ao corretor</w:t>
-      </w:r>
-    </w:p>
-    <w:p>
-      <w:r>
-        <w:t>Confirmar contrato, endereço segurado, data do evento, fotos, documentos disponíveis e diferença entre explicação geral e análise oficial.</w:t>
+        <w:t>募集人への対応方針</w:t>
+      </w:r>
+    </w:p>
+    <w:p>
+      <w:r>
+        <w:t>火災保険の補償、対象物、事故原因、免責金額、必要書類を確認する場面。契約書、保険証券、写真、領収書、管理会社または保険会社からの案内を確認し、一般説明と正式判断を分けて案内します。</w:t>
       </w:r>
     </w:p>
     <w:p>
@@ -964,12 +994,22 @@
         <w:pStyle w:val="Heading2"/>
       </w:pPr>
       <w:r>
-        <w:t>Como explicar ao cliente brasileiro</w:t>
-      </w:r>
-    </w:p>
-    <w:p>
-      <w:r>
-        <w:t>Vamos primeiro verificar o que está segurado, qual foi a causa do dano e quais documentos a seguradora precisa analisar.</w:t>
+        <w:t>ブラジル人顧客への説明方法</w:t>
+      </w:r>
+    </w:p>
+    <w:p>
+      <w:r>
+        <w:t>Leitura para pronúncia: ヴァモス プリメイロ ヴェリフィカール オ キ エスタ セグラード クアウ フォイ ア カウザ ド ダノ イ クアイス ドクメントス ア セグラドーラ プレシーザ アナリザール</w:t>
+      </w:r>
+    </w:p>
+    <w:p>
+      <w:r>
+        <w:t>Português brasileiro: Vamos primeiro verificar o que está segurado, qual foi a causa do dano e quais documentos a seguradora precisa analisar.</w:t>
+      </w:r>
+    </w:p>
+    <w:p>
+      <w:r>
+        <w:t>日本語確認用: 契約内容、必要書類、関係先の確認を分けて案内します。</w:t>
       </w:r>
     </w:p>
     <w:p>
@@ -977,12 +1017,12 @@
         <w:pStyle w:val="Heading2"/>
       </w:pPr>
       <w:r>
-        <w:t>Resultado esperado</w:t>
-      </w:r>
-    </w:p>
-    <w:p>
-      <w:r>
-        <w:t>Cliente entende o próximo passo e evita concluir sozinho que o dano será pago ou recusado.</w:t>
+        <w:t>期待される結果</w:t>
+      </w:r>
+    </w:p>
+    <w:p>
+      <w:r>
+        <w:t>お客様が次に確認すべき書類、連絡先、判断できることと判断できないことを理解する。</w:t>
       </w:r>
     </w:p>
     <w:p>
@@ -990,12 +1030,12 @@
         <w:pStyle w:val="Heading2"/>
       </w:pPr>
       <w:r>
-        <w:t>Limite comercial/compliance</w:t>
-      </w:r>
-    </w:p>
-    <w:p>
-      <w:r>
-        <w:t>O corretor deve usar este caso como orientação de atendimento, sem prometer aceitação, cobertura, valor de indenização, prazo ou pagamento. A decisão final depende da apólice, causa do sinistro, franquia, exclusões, documentos e avaliação da seguradora.</w:t>
+        <w:t>コンプライアンス上の注意</w:t>
+      </w:r>
+    </w:p>
+    <w:p>
+      <w:r>
+        <w:t>募集人はこのケースを対応方針として使用し、契約成立、補償、支払可否、返金、費用免除、審査結果、保険金額を断定しない。最終判断は契約条件、提出書類、事故原因、関係先および保険会社の確認による。</w:t>
       </w:r>
     </w:p>
     <w:p>
@@ -1003,7 +1043,7 @@
         <w:pStyle w:val="Heading2"/>
       </w:pPr>
       <w:r>
-        <w:t>Termos relacionados</w:t>
+        <w:t>関連用語</w:t>
       </w:r>
     </w:p>
     <w:p>
@@ -1035,7 +1075,7 @@
         <w:pStyle w:val="Heading2"/>
       </w:pPr>
       <w:r>
-        <w:t>FAQs relacionadas</w:t>
+        <w:t>関連FAQ</w:t>
       </w:r>
     </w:p>
     <w:p>
@@ -1067,7 +1107,7 @@
         <w:pStyle w:val="Heading2"/>
       </w:pPr>
       <w:r>
-        <w:t>Diálogos relacionados</w:t>
+        <w:t>関連対話</w:t>
       </w:r>
     </w:p>
     <w:p>
@@ -1083,7 +1123,7 @@
         <w:pStyle w:val="Heading2"/>
       </w:pPr>
       <w:r>
-        <w:t>Referências cruzadas</w:t>
+        <w:t>相互参照</w:t>
       </w:r>
     </w:p>
     <w:p>
@@ -1147,7 +1187,7 @@
         <w:pStyle w:val="Heading2"/>
       </w:pPr>
       <w:r>
-        <w:t>Referências</w:t>
+        <w:t>参考資料</w:t>
       </w:r>
     </w:p>
     <w:p>
@@ -1163,7 +1203,7 @@
         <w:pStyle w:val="Heading2"/>
       </w:pPr>
       <w:r>
-        <w:t>Tags</w:t>
+        <w:t>タグ</w:t>
       </w:r>
     </w:p>
     <w:p>
@@ -1195,7 +1235,7 @@
         <w:pStyle w:val="ListBullet"/>
       </w:pPr>
       <w:r>
-        <w:t>sinistro</w:t>
+        <w:t>japanese-broker</w:t>
       </w:r>
     </w:p>
     <w:p>
@@ -1203,7 +1243,7 @@
         <w:pStyle w:val="Heading2"/>
       </w:pPr>
       <w:r>
-        <w:t>Veja também</w:t>
+        <w:t>関連項目</w:t>
       </w:r>
     </w:p>
     <w:p>
@@ -1219,7 +1259,7 @@
         <w:pStyle w:val="Heading2"/>
       </w:pPr>
       <w:r>
-        <w:t>Histórico de revisão</w:t>
+        <w:t>改訂履歴</w:t>
       </w:r>
     </w:p>
     <w:p>
@@ -1239,6 +1279,11 @@
     </w:p>
     <w:p>
       <w:r>
+        <w:t>| 2026-06-27 | 0.2 | JP-BR Insurance Knowledge Base | Padronização para uso do corretor japonês com explicação em português e leitura em katakana. |</w:t>
+      </w:r>
+    </w:p>
+    <w:p>
+      <w:r>
         <w:br w:type="page"/>
       </w:r>
     </w:p>
@@ -1255,7 +1300,7 @@
         <w:pStyle w:val="Heading2"/>
       </w:pPr>
       <w:r>
-        <w:t>Controle</w:t>
+        <w:t>管理情報</w:t>
       </w:r>
     </w:p>
     <w:p>
@@ -1263,7 +1308,7 @@
         <w:pStyle w:val="ListBullet"/>
       </w:pPr>
       <w:r>
-        <w:t>Versão: 0.1</w:t>
+        <w:t>Versão: 0.2</w:t>
       </w:r>
     </w:p>
     <w:p>
@@ -1287,7 +1332,7 @@
         <w:pStyle w:val="ListBullet"/>
       </w:pPr>
       <w:r>
-        <w:t>Histórico: Criação inicial.</w:t>
+        <w:t>Histórico: Criação inicial; padronização para uso do corretor japonês com explicação em português e leitura em katakana.</w:t>
       </w:r>
     </w:p>
     <w:p>
@@ -1295,7 +1340,7 @@
         <w:pStyle w:val="Heading2"/>
       </w:pPr>
       <w:r>
-        <w:t>Código</w:t>
+        <w:t>コード</w:t>
       </w:r>
     </w:p>
     <w:p>
@@ -1308,7 +1353,7 @@
         <w:pStyle w:val="Heading2"/>
       </w:pPr>
       <w:r>
-        <w:t>Produto ou categoria</w:t>
+        <w:t>商品・カテゴリー</w:t>
       </w:r>
     </w:p>
     <w:p>
@@ -1321,12 +1366,12 @@
         <w:pStyle w:val="Heading2"/>
       </w:pPr>
       <w:r>
-        <w:t>Situação</w:t>
-      </w:r>
-    </w:p>
-    <w:p>
-      <w:r>
-        <w:t>Cliente confunde inundação com vazamento interno.</w:t>
+        <w:t>状況</w:t>
+      </w:r>
+    </w:p>
+    <w:p>
+      <w:r>
+        <w:t>火災保険に関する具体的な相談ケース。お客様が補償範囲、事故原因、必要書類、支払可否について確認している場面。</w:t>
       </w:r>
     </w:p>
     <w:p>
@@ -1334,12 +1379,12 @@
         <w:pStyle w:val="Heading2"/>
       </w:pPr>
       <w:r>
-        <w:t>Problema</w:t>
-      </w:r>
-    </w:p>
-    <w:p>
-      <w:r>
-        <w:t>Cliente pode interpretar cobertura, franquia, objeto segurado ou documentos de forma incorreta e criar expectativa de pagamento automático.</w:t>
+        <w:t>問題</w:t>
+      </w:r>
+    </w:p>
+    <w:p>
+      <w:r>
+        <w:t>お客様が契約上の義務、補償範囲、費用負担、必要書類、保険会社または関係先の判断を混同し、支払いや免除を期待してしまう可能性があります。</w:t>
       </w:r>
     </w:p>
     <w:p>
@@ -1347,12 +1392,12 @@
         <w:pStyle w:val="Heading2"/>
       </w:pPr>
       <w:r>
-        <w:t>Análise</w:t>
-      </w:r>
-    </w:p>
-    <w:p>
-      <w:r>
-        <w:t>O atendimento deve separar objeto segurado, causa do dano, cobertura contratada, franquia, documentos e decisão formal da seguradora.</w:t>
+        <w:t>分析</w:t>
+      </w:r>
+    </w:p>
+    <w:p>
+      <w:r>
+        <w:t>対象物、事故原因、契約条件、免責金額、写真、見積書、領収書、保険会社の確認を分けて整理する必要があります。</w:t>
       </w:r>
     </w:p>
     <w:p>
@@ -1360,12 +1405,12 @@
         <w:pStyle w:val="Heading2"/>
       </w:pPr>
       <w:r>
-        <w:t>Orientação ao corretor</w:t>
-      </w:r>
-    </w:p>
-    <w:p>
-      <w:r>
-        <w:t>Confirmar contrato, endereço segurado, data do evento, fotos, documentos disponíveis e diferença entre explicação geral e análise oficial.</w:t>
+        <w:t>募集人への対応方針</w:t>
+      </w:r>
+    </w:p>
+    <w:p>
+      <w:r>
+        <w:t>火災保険の補償、対象物、事故原因、免責金額、必要書類を確認する場面。契約書、保険証券、写真、領収書、管理会社または保険会社からの案内を確認し、一般説明と正式判断を分けて案内します。</w:t>
       </w:r>
     </w:p>
     <w:p>
@@ -1373,12 +1418,22 @@
         <w:pStyle w:val="Heading2"/>
       </w:pPr>
       <w:r>
-        <w:t>Como explicar ao cliente brasileiro</w:t>
-      </w:r>
-    </w:p>
-    <w:p>
-      <w:r>
-        <w:t>Vamos primeiro verificar o que está segurado, qual foi a causa do dano e quais documentos a seguradora precisa analisar.</w:t>
+        <w:t>ブラジル人顧客への説明方法</w:t>
+      </w:r>
+    </w:p>
+    <w:p>
+      <w:r>
+        <w:t>Leitura para pronúncia: ヴァモス プリメイロ ヴェリフィカール オ キ エスタ セグラード クアウ フォイ ア カウザ ド ダノ イ クアイス ドクメントス ア セグラドーラ プレシーザ アナリザール</w:t>
+      </w:r>
+    </w:p>
+    <w:p>
+      <w:r>
+        <w:t>Português brasileiro: Vamos primeiro verificar o que está segurado, qual foi a causa do dano e quais documentos a seguradora precisa analisar.</w:t>
+      </w:r>
+    </w:p>
+    <w:p>
+      <w:r>
+        <w:t>日本語確認用: 契約内容、必要書類、関係先の確認を分けて案内します。</w:t>
       </w:r>
     </w:p>
     <w:p>
@@ -1386,12 +1441,12 @@
         <w:pStyle w:val="Heading2"/>
       </w:pPr>
       <w:r>
-        <w:t>Resultado esperado</w:t>
-      </w:r>
-    </w:p>
-    <w:p>
-      <w:r>
-        <w:t>Cliente entende o próximo passo e evita concluir sozinho que o dano será pago ou recusado.</w:t>
+        <w:t>期待される結果</w:t>
+      </w:r>
+    </w:p>
+    <w:p>
+      <w:r>
+        <w:t>お客様が次に確認すべき書類、連絡先、判断できることと判断できないことを理解する。</w:t>
       </w:r>
     </w:p>
     <w:p>
@@ -1399,12 +1454,12 @@
         <w:pStyle w:val="Heading2"/>
       </w:pPr>
       <w:r>
-        <w:t>Limite comercial/compliance</w:t>
-      </w:r>
-    </w:p>
-    <w:p>
-      <w:r>
-        <w:t>O corretor deve usar este caso como orientação de atendimento, sem prometer aceitação, cobertura, valor de indenização, prazo ou pagamento. A decisão final depende da apólice, causa do sinistro, franquia, exclusões, documentos e avaliação da seguradora.</w:t>
+        <w:t>コンプライアンス上の注意</w:t>
+      </w:r>
+    </w:p>
+    <w:p>
+      <w:r>
+        <w:t>募集人はこのケースを対応方針として使用し、契約成立、補償、支払可否、返金、費用免除、審査結果、保険金額を断定しない。最終判断は契約条件、提出書類、事故原因、関係先および保険会社の確認による。</w:t>
       </w:r>
     </w:p>
     <w:p>
@@ -1412,7 +1467,7 @@
         <w:pStyle w:val="Heading2"/>
       </w:pPr>
       <w:r>
-        <w:t>Termos relacionados</w:t>
+        <w:t>関連用語</w:t>
       </w:r>
     </w:p>
     <w:p>
@@ -1444,7 +1499,7 @@
         <w:pStyle w:val="Heading2"/>
       </w:pPr>
       <w:r>
-        <w:t>FAQs relacionadas</w:t>
+        <w:t>関連FAQ</w:t>
       </w:r>
     </w:p>
     <w:p>
@@ -1476,7 +1531,7 @@
         <w:pStyle w:val="Heading2"/>
       </w:pPr>
       <w:r>
-        <w:t>Diálogos relacionados</w:t>
+        <w:t>関連対話</w:t>
       </w:r>
     </w:p>
     <w:p>
@@ -1492,7 +1547,7 @@
         <w:pStyle w:val="Heading2"/>
       </w:pPr>
       <w:r>
-        <w:t>Referências cruzadas</w:t>
+        <w:t>相互参照</w:t>
       </w:r>
     </w:p>
     <w:p>
@@ -1556,7 +1611,7 @@
         <w:pStyle w:val="Heading2"/>
       </w:pPr>
       <w:r>
-        <w:t>Referências</w:t>
+        <w:t>参考資料</w:t>
       </w:r>
     </w:p>
     <w:p>
@@ -1572,7 +1627,7 @@
         <w:pStyle w:val="Heading2"/>
       </w:pPr>
       <w:r>
-        <w:t>Tags</w:t>
+        <w:t>タグ</w:t>
       </w:r>
     </w:p>
     <w:p>
@@ -1604,7 +1659,7 @@
         <w:pStyle w:val="ListBullet"/>
       </w:pPr>
       <w:r>
-        <w:t>sinistro</w:t>
+        <w:t>japanese-broker</w:t>
       </w:r>
     </w:p>
     <w:p>
@@ -1612,7 +1667,7 @@
         <w:pStyle w:val="Heading2"/>
       </w:pPr>
       <w:r>
-        <w:t>Veja também</w:t>
+        <w:t>関連項目</w:t>
       </w:r>
     </w:p>
     <w:p>
@@ -1628,7 +1683,7 @@
         <w:pStyle w:val="Heading2"/>
       </w:pPr>
       <w:r>
-        <w:t>Histórico de revisão</w:t>
+        <w:t>改訂履歴</w:t>
       </w:r>
     </w:p>
     <w:p>
@@ -1648,6 +1703,11 @@
     </w:p>
     <w:p>
       <w:r>
+        <w:t>| 2026-06-27 | 0.2 | JP-BR Insurance Knowledge Base | Padronização para uso do corretor japonês com explicação em português e leitura em katakana. |</w:t>
+      </w:r>
+    </w:p>
+    <w:p>
+      <w:r>
         <w:br w:type="page"/>
       </w:r>
     </w:p>
@@ -1664,7 +1724,7 @@
         <w:pStyle w:val="Heading2"/>
       </w:pPr>
       <w:r>
-        <w:t>Controle</w:t>
+        <w:t>管理情報</w:t>
       </w:r>
     </w:p>
     <w:p>
@@ -1672,7 +1732,7 @@
         <w:pStyle w:val="ListBullet"/>
       </w:pPr>
       <w:r>
-        <w:t>Versão: 0.1</w:t>
+        <w:t>Versão: 0.2</w:t>
       </w:r>
     </w:p>
     <w:p>
@@ -1696,7 +1756,7 @@
         <w:pStyle w:val="ListBullet"/>
       </w:pPr>
       <w:r>
-        <w:t>Histórico: Criação inicial.</w:t>
+        <w:t>Histórico: Criação inicial; padronização para uso do corretor japonês com explicação em português e leitura em katakana.</w:t>
       </w:r>
     </w:p>
     <w:p>
@@ -1704,7 +1764,7 @@
         <w:pStyle w:val="Heading2"/>
       </w:pPr>
       <w:r>
-        <w:t>Código</w:t>
+        <w:t>コード</w:t>
       </w:r>
     </w:p>
     <w:p>
@@ -1717,7 +1777,7 @@
         <w:pStyle w:val="Heading2"/>
       </w:pPr>
       <w:r>
-        <w:t>Produto ou categoria</w:t>
+        <w:t>商品・カテゴリー</w:t>
       </w:r>
     </w:p>
     <w:p>
@@ -1730,12 +1790,12 @@
         <w:pStyle w:val="Heading2"/>
       </w:pPr>
       <w:r>
-        <w:t>Situação</w:t>
-      </w:r>
-    </w:p>
-    <w:p>
-      <w:r>
-        <w:t>Cliente pergunta se furto de bens dentro da residência está coberto.</w:t>
+        <w:t>状況</w:t>
+      </w:r>
+    </w:p>
+    <w:p>
+      <w:r>
+        <w:t>火災保険に関する具体的な相談ケース。お客様が補償範囲、事故原因、必要書類、支払可否について確認している場面。</w:t>
       </w:r>
     </w:p>
     <w:p>
@@ -1743,12 +1803,12 @@
         <w:pStyle w:val="Heading2"/>
       </w:pPr>
       <w:r>
-        <w:t>Problema</w:t>
-      </w:r>
-    </w:p>
-    <w:p>
-      <w:r>
-        <w:t>Cliente pode interpretar cobertura, franquia, objeto segurado ou documentos de forma incorreta e criar expectativa de pagamento automático.</w:t>
+        <w:t>問題</w:t>
+      </w:r>
+    </w:p>
+    <w:p>
+      <w:r>
+        <w:t>お客様が契約上の義務、補償範囲、費用負担、必要書類、保険会社または関係先の判断を混同し、支払いや免除を期待してしまう可能性があります。</w:t>
       </w:r>
     </w:p>
     <w:p>
@@ -1756,12 +1816,12 @@
         <w:pStyle w:val="Heading2"/>
       </w:pPr>
       <w:r>
-        <w:t>Análise</w:t>
-      </w:r>
-    </w:p>
-    <w:p>
-      <w:r>
-        <w:t>O atendimento deve separar objeto segurado, causa do dano, cobertura contratada, franquia, documentos e decisão formal da seguradora.</w:t>
+        <w:t>分析</w:t>
+      </w:r>
+    </w:p>
+    <w:p>
+      <w:r>
+        <w:t>対象物、事故原因、契約条件、免責金額、写真、見積書、領収書、保険会社の確認を分けて整理する必要があります。</w:t>
       </w:r>
     </w:p>
     <w:p>
@@ -1769,12 +1829,12 @@
         <w:pStyle w:val="Heading2"/>
       </w:pPr>
       <w:r>
-        <w:t>Orientação ao corretor</w:t>
-      </w:r>
-    </w:p>
-    <w:p>
-      <w:r>
-        <w:t>Confirmar contrato, endereço segurado, data do evento, fotos, documentos disponíveis e diferença entre explicação geral e análise oficial.</w:t>
+        <w:t>募集人への対応方針</w:t>
+      </w:r>
+    </w:p>
+    <w:p>
+      <w:r>
+        <w:t>火災保険の補償、対象物、事故原因、免責金額、必要書類を確認する場面。契約書、保険証券、写真、領収書、管理会社または保険会社からの案内を確認し、一般説明と正式判断を分けて案内します。</w:t>
       </w:r>
     </w:p>
     <w:p>
@@ -1782,12 +1842,22 @@
         <w:pStyle w:val="Heading2"/>
       </w:pPr>
       <w:r>
-        <w:t>Como explicar ao cliente brasileiro</w:t>
-      </w:r>
-    </w:p>
-    <w:p>
-      <w:r>
-        <w:t>Vamos primeiro verificar o que está segurado, qual foi a causa do dano e quais documentos a seguradora precisa analisar.</w:t>
+        <w:t>ブラジル人顧客への説明方法</w:t>
+      </w:r>
+    </w:p>
+    <w:p>
+      <w:r>
+        <w:t>Leitura para pronúncia: ヴァモス プリメイロ ヴェリフィカール オ キ エスタ セグラード クアウ フォイ ア カウザ ド ダノ イ クアイス ドクメントス ア セグラドーラ プレシーザ アナリザール</w:t>
+      </w:r>
+    </w:p>
+    <w:p>
+      <w:r>
+        <w:t>Português brasileiro: Vamos primeiro verificar o que está segurado, qual foi a causa do dano e quais documentos a seguradora precisa analisar.</w:t>
+      </w:r>
+    </w:p>
+    <w:p>
+      <w:r>
+        <w:t>日本語確認用: 契約内容、必要書類、関係先の確認を分けて案内します。</w:t>
       </w:r>
     </w:p>
     <w:p>
@@ -1795,12 +1865,12 @@
         <w:pStyle w:val="Heading2"/>
       </w:pPr>
       <w:r>
-        <w:t>Resultado esperado</w:t>
-      </w:r>
-    </w:p>
-    <w:p>
-      <w:r>
-        <w:t>Cliente entende o próximo passo e evita concluir sozinho que o dano será pago ou recusado.</w:t>
+        <w:t>期待される結果</w:t>
+      </w:r>
+    </w:p>
+    <w:p>
+      <w:r>
+        <w:t>お客様が次に確認すべき書類、連絡先、判断できることと判断できないことを理解する。</w:t>
       </w:r>
     </w:p>
     <w:p>
@@ -1808,12 +1878,12 @@
         <w:pStyle w:val="Heading2"/>
       </w:pPr>
       <w:r>
-        <w:t>Limite comercial/compliance</w:t>
-      </w:r>
-    </w:p>
-    <w:p>
-      <w:r>
-        <w:t>O corretor deve usar este caso como orientação de atendimento, sem prometer aceitação, cobertura, valor de indenização, prazo ou pagamento. A decisão final depende da apólice, causa do sinistro, franquia, exclusões, documentos e avaliação da seguradora.</w:t>
+        <w:t>コンプライアンス上の注意</w:t>
+      </w:r>
+    </w:p>
+    <w:p>
+      <w:r>
+        <w:t>募集人はこのケースを対応方針として使用し、契約成立、補償、支払可否、返金、費用免除、審査結果、保険金額を断定しない。最終判断は契約条件、提出書類、事故原因、関係先および保険会社の確認による。</w:t>
       </w:r>
     </w:p>
     <w:p>
@@ -1821,7 +1891,7 @@
         <w:pStyle w:val="Heading2"/>
       </w:pPr>
       <w:r>
-        <w:t>Termos relacionados</w:t>
+        <w:t>関連用語</w:t>
       </w:r>
     </w:p>
     <w:p>
@@ -1853,7 +1923,7 @@
         <w:pStyle w:val="Heading2"/>
       </w:pPr>
       <w:r>
-        <w:t>FAQs relacionadas</w:t>
+        <w:t>関連FAQ</w:t>
       </w:r>
     </w:p>
     <w:p>
@@ -1885,7 +1955,7 @@
         <w:pStyle w:val="Heading2"/>
       </w:pPr>
       <w:r>
-        <w:t>Diálogos relacionados</w:t>
+        <w:t>関連対話</w:t>
       </w:r>
     </w:p>
     <w:p>
@@ -1901,7 +1971,7 @@
         <w:pStyle w:val="Heading2"/>
       </w:pPr>
       <w:r>
-        <w:t>Referências cruzadas</w:t>
+        <w:t>相互参照</w:t>
       </w:r>
     </w:p>
     <w:p>
@@ -1965,7 +2035,7 @@
         <w:pStyle w:val="Heading2"/>
       </w:pPr>
       <w:r>
-        <w:t>Referências</w:t>
+        <w:t>参考資料</w:t>
       </w:r>
     </w:p>
     <w:p>
@@ -1981,7 +2051,7 @@
         <w:pStyle w:val="Heading2"/>
       </w:pPr>
       <w:r>
-        <w:t>Tags</w:t>
+        <w:t>タグ</w:t>
       </w:r>
     </w:p>
     <w:p>
@@ -2013,7 +2083,7 @@
         <w:pStyle w:val="ListBullet"/>
       </w:pPr>
       <w:r>
-        <w:t>sinistro</w:t>
+        <w:t>japanese-broker</w:t>
       </w:r>
     </w:p>
     <w:p>
@@ -2021,7 +2091,7 @@
         <w:pStyle w:val="Heading2"/>
       </w:pPr>
       <w:r>
-        <w:t>Veja também</w:t>
+        <w:t>関連項目</w:t>
       </w:r>
     </w:p>
     <w:p>
@@ -2037,7 +2107,7 @@
         <w:pStyle w:val="Heading2"/>
       </w:pPr>
       <w:r>
-        <w:t>Histórico de revisão</w:t>
+        <w:t>改訂履歴</w:t>
       </w:r>
     </w:p>
     <w:p>
@@ -2057,6 +2127,11 @@
     </w:p>
     <w:p>
       <w:r>
+        <w:t>| 2026-06-27 | 0.2 | JP-BR Insurance Knowledge Base | Padronização para uso do corretor japonês com explicação em português e leitura em katakana. |</w:t>
+      </w:r>
+    </w:p>
+    <w:p>
+      <w:r>
         <w:br w:type="page"/>
       </w:r>
     </w:p>
@@ -2073,7 +2148,7 @@
         <w:pStyle w:val="Heading2"/>
       </w:pPr>
       <w:r>
-        <w:t>Controle</w:t>
+        <w:t>管理情報</w:t>
       </w:r>
     </w:p>
     <w:p>
@@ -2081,7 +2156,7 @@
         <w:pStyle w:val="ListBullet"/>
       </w:pPr>
       <w:r>
-        <w:t>Versão: 0.1</w:t>
+        <w:t>Versão: 0.2</w:t>
       </w:r>
     </w:p>
     <w:p>
@@ -2105,7 +2180,7 @@
         <w:pStyle w:val="ListBullet"/>
       </w:pPr>
       <w:r>
-        <w:t>Histórico: Criação inicial.</w:t>
+        <w:t>Histórico: Criação inicial; padronização para uso do corretor japonês com explicação em português e leitura em katakana.</w:t>
       </w:r>
     </w:p>
     <w:p>
@@ -2113,7 +2188,7 @@
         <w:pStyle w:val="Heading2"/>
       </w:pPr>
       <w:r>
-        <w:t>Código</w:t>
+        <w:t>コード</w:t>
       </w:r>
     </w:p>
     <w:p>
@@ -2126,7 +2201,7 @@
         <w:pStyle w:val="Heading2"/>
       </w:pPr>
       <w:r>
-        <w:t>Produto ou categoria</w:t>
+        <w:t>商品・カテゴリー</w:t>
       </w:r>
     </w:p>
     <w:p>
@@ -2139,12 +2214,12 @@
         <w:pStyle w:val="Heading2"/>
       </w:pPr>
       <w:r>
-        <w:t>Situação</w:t>
-      </w:r>
-    </w:p>
-    <w:p>
-      <w:r>
-        <w:t>Cliente quer cobertura para quebra acidental dentro da casa.</w:t>
+        <w:t>状況</w:t>
+      </w:r>
+    </w:p>
+    <w:p>
+      <w:r>
+        <w:t>火災保険に関する具体的な相談ケース。お客様が補償範囲、事故原因、必要書類、支払可否について確認している場面。</w:t>
       </w:r>
     </w:p>
     <w:p>
@@ -2152,12 +2227,12 @@
         <w:pStyle w:val="Heading2"/>
       </w:pPr>
       <w:r>
-        <w:t>Problema</w:t>
-      </w:r>
-    </w:p>
-    <w:p>
-      <w:r>
-        <w:t>Cliente pode interpretar cobertura, franquia, objeto segurado ou documentos de forma incorreta e criar expectativa de pagamento automático.</w:t>
+        <w:t>問題</w:t>
+      </w:r>
+    </w:p>
+    <w:p>
+      <w:r>
+        <w:t>お客様が契約上の義務、補償範囲、費用負担、必要書類、保険会社または関係先の判断を混同し、支払いや免除を期待してしまう可能性があります。</w:t>
       </w:r>
     </w:p>
     <w:p>
@@ -2165,12 +2240,12 @@
         <w:pStyle w:val="Heading2"/>
       </w:pPr>
       <w:r>
-        <w:t>Análise</w:t>
-      </w:r>
-    </w:p>
-    <w:p>
-      <w:r>
-        <w:t>O atendimento deve separar objeto segurado, causa do dano, cobertura contratada, franquia, documentos e decisão formal da seguradora.</w:t>
+        <w:t>分析</w:t>
+      </w:r>
+    </w:p>
+    <w:p>
+      <w:r>
+        <w:t>対象物、事故原因、契約条件、免責金額、写真、見積書、領収書、保険会社の確認を分けて整理する必要があります。</w:t>
       </w:r>
     </w:p>
     <w:p>
@@ -2178,12 +2253,12 @@
         <w:pStyle w:val="Heading2"/>
       </w:pPr>
       <w:r>
-        <w:t>Orientação ao corretor</w:t>
-      </w:r>
-    </w:p>
-    <w:p>
-      <w:r>
-        <w:t>Confirmar contrato, endereço segurado, data do evento, fotos, documentos disponíveis e diferença entre explicação geral e análise oficial.</w:t>
+        <w:t>募集人への対応方針</w:t>
+      </w:r>
+    </w:p>
+    <w:p>
+      <w:r>
+        <w:t>火災保険の補償、対象物、事故原因、免責金額、必要書類を確認する場面。契約書、保険証券、写真、領収書、管理会社または保険会社からの案内を確認し、一般説明と正式判断を分けて案内します。</w:t>
       </w:r>
     </w:p>
     <w:p>
@@ -2191,12 +2266,22 @@
         <w:pStyle w:val="Heading2"/>
       </w:pPr>
       <w:r>
-        <w:t>Como explicar ao cliente brasileiro</w:t>
-      </w:r>
-    </w:p>
-    <w:p>
-      <w:r>
-        <w:t>Vamos primeiro verificar o que está segurado, qual foi a causa do dano e quais documentos a seguradora precisa analisar.</w:t>
+        <w:t>ブラジル人顧客への説明方法</w:t>
+      </w:r>
+    </w:p>
+    <w:p>
+      <w:r>
+        <w:t>Leitura para pronúncia: ヴァモス プリメイロ ヴェリフィカール オ キ エスタ セグラード クアウ フォイ ア カウザ ド ダノ イ クアイス ドクメントス ア セグラドーラ プレシーザ アナリザール</w:t>
+      </w:r>
+    </w:p>
+    <w:p>
+      <w:r>
+        <w:t>Português brasileiro: Vamos primeiro verificar o que está segurado, qual foi a causa do dano e quais documentos a seguradora precisa analisar.</w:t>
+      </w:r>
+    </w:p>
+    <w:p>
+      <w:r>
+        <w:t>日本語確認用: 契約内容、必要書類、関係先の確認を分けて案内します。</w:t>
       </w:r>
     </w:p>
     <w:p>
@@ -2204,12 +2289,12 @@
         <w:pStyle w:val="Heading2"/>
       </w:pPr>
       <w:r>
-        <w:t>Resultado esperado</w:t>
-      </w:r>
-    </w:p>
-    <w:p>
-      <w:r>
-        <w:t>Cliente entende o próximo passo e evita concluir sozinho que o dano será pago ou recusado.</w:t>
+        <w:t>期待される結果</w:t>
+      </w:r>
+    </w:p>
+    <w:p>
+      <w:r>
+        <w:t>お客様が次に確認すべき書類、連絡先、判断できることと判断できないことを理解する。</w:t>
       </w:r>
     </w:p>
     <w:p>
@@ -2217,12 +2302,12 @@
         <w:pStyle w:val="Heading2"/>
       </w:pPr>
       <w:r>
-        <w:t>Limite comercial/compliance</w:t>
-      </w:r>
-    </w:p>
-    <w:p>
-      <w:r>
-        <w:t>O corretor deve usar este caso como orientação de atendimento, sem prometer aceitação, cobertura, valor de indenização, prazo ou pagamento. A decisão final depende da apólice, causa do sinistro, franquia, exclusões, documentos e avaliação da seguradora.</w:t>
+        <w:t>コンプライアンス上の注意</w:t>
+      </w:r>
+    </w:p>
+    <w:p>
+      <w:r>
+        <w:t>募集人はこのケースを対応方針として使用し、契約成立、補償、支払可否、返金、費用免除、審査結果、保険金額を断定しない。最終判断は契約条件、提出書類、事故原因、関係先および保険会社の確認による。</w:t>
       </w:r>
     </w:p>
     <w:p>
@@ -2230,7 +2315,7 @@
         <w:pStyle w:val="Heading2"/>
       </w:pPr>
       <w:r>
-        <w:t>Termos relacionados</w:t>
+        <w:t>関連用語</w:t>
       </w:r>
     </w:p>
     <w:p>
@@ -2262,7 +2347,7 @@
         <w:pStyle w:val="Heading2"/>
       </w:pPr>
       <w:r>
-        <w:t>FAQs relacionadas</w:t>
+        <w:t>関連FAQ</w:t>
       </w:r>
     </w:p>
     <w:p>
@@ -2294,7 +2379,7 @@
         <w:pStyle w:val="Heading2"/>
       </w:pPr>
       <w:r>
-        <w:t>Diálogos relacionados</w:t>
+        <w:t>関連対話</w:t>
       </w:r>
     </w:p>
     <w:p>
@@ -2310,7 +2395,7 @@
         <w:pStyle w:val="Heading2"/>
       </w:pPr>
       <w:r>
-        <w:t>Referências cruzadas</w:t>
+        <w:t>相互参照</w:t>
       </w:r>
     </w:p>
     <w:p>
@@ -2374,7 +2459,7 @@
         <w:pStyle w:val="Heading2"/>
       </w:pPr>
       <w:r>
-        <w:t>Referências</w:t>
+        <w:t>参考資料</w:t>
       </w:r>
     </w:p>
     <w:p>
@@ -2390,7 +2475,7 @@
         <w:pStyle w:val="Heading2"/>
       </w:pPr>
       <w:r>
-        <w:t>Tags</w:t>
+        <w:t>タグ</w:t>
       </w:r>
     </w:p>
     <w:p>
@@ -2422,7 +2507,7 @@
         <w:pStyle w:val="ListBullet"/>
       </w:pPr>
       <w:r>
-        <w:t>sinistro</w:t>
+        <w:t>japanese-broker</w:t>
       </w:r>
     </w:p>
     <w:p>
@@ -2430,7 +2515,7 @@
         <w:pStyle w:val="Heading2"/>
       </w:pPr>
       <w:r>
-        <w:t>Veja também</w:t>
+        <w:t>関連項目</w:t>
       </w:r>
     </w:p>
     <w:p>
@@ -2446,7 +2531,7 @@
         <w:pStyle w:val="Heading2"/>
       </w:pPr>
       <w:r>
-        <w:t>Histórico de revisão</w:t>
+        <w:t>改訂履歴</w:t>
       </w:r>
     </w:p>
     <w:p>
@@ -2466,6 +2551,11 @@
     </w:p>
     <w:p>
       <w:r>
+        <w:t>| 2026-06-27 | 0.2 | JP-BR Insurance Knowledge Base | Padronização para uso do corretor japonês com explicação em português e leitura em katakana. |</w:t>
+      </w:r>
+    </w:p>
+    <w:p>
+      <w:r>
         <w:br w:type="page"/>
       </w:r>
     </w:p>
@@ -2482,7 +2572,7 @@
         <w:pStyle w:val="Heading2"/>
       </w:pPr>
       <w:r>
-        <w:t>Controle</w:t>
+        <w:t>管理情報</w:t>
       </w:r>
     </w:p>
     <w:p>
@@ -2490,7 +2580,7 @@
         <w:pStyle w:val="ListBullet"/>
       </w:pPr>
       <w:r>
-        <w:t>Versão: 0.1</w:t>
+        <w:t>Versão: 0.2</w:t>
       </w:r>
     </w:p>
     <w:p>
@@ -2514,7 +2604,7 @@
         <w:pStyle w:val="ListBullet"/>
       </w:pPr>
       <w:r>
-        <w:t>Histórico: Criação inicial.</w:t>
+        <w:t>Histórico: Criação inicial; padronização para uso do corretor japonês com explicação em português e leitura em katakana.</w:t>
       </w:r>
     </w:p>
     <w:p>
@@ -2522,7 +2612,7 @@
         <w:pStyle w:val="Heading2"/>
       </w:pPr>
       <w:r>
-        <w:t>Código</w:t>
+        <w:t>コード</w:t>
       </w:r>
     </w:p>
     <w:p>
@@ -2535,7 +2625,7 @@
         <w:pStyle w:val="Heading2"/>
       </w:pPr>
       <w:r>
-        <w:t>Produto ou categoria</w:t>
+        <w:t>商品・カテゴリー</w:t>
       </w:r>
     </w:p>
     <w:p>
@@ -2548,12 +2638,12 @@
         <w:pStyle w:val="Heading2"/>
       </w:pPr>
       <w:r>
-        <w:t>Situação</w:t>
-      </w:r>
-    </w:p>
-    <w:p>
-      <w:r>
-        <w:t>Cliente pergunta se terremoto está incluído no seguro contra incêndio.</w:t>
+        <w:t>状況</w:t>
+      </w:r>
+    </w:p>
+    <w:p>
+      <w:r>
+        <w:t>火災保険に関する具体的な相談ケース。お客様が補償範囲、事故原因、必要書類、支払可否について確認している場面。</w:t>
       </w:r>
     </w:p>
     <w:p>
@@ -2561,12 +2651,12 @@
         <w:pStyle w:val="Heading2"/>
       </w:pPr>
       <w:r>
-        <w:t>Problema</w:t>
-      </w:r>
-    </w:p>
-    <w:p>
-      <w:r>
-        <w:t>Cliente pode interpretar cobertura, franquia, objeto segurado ou documentos de forma incorreta e criar expectativa de pagamento automático.</w:t>
+        <w:t>問題</w:t>
+      </w:r>
+    </w:p>
+    <w:p>
+      <w:r>
+        <w:t>お客様が契約上の義務、補償範囲、費用負担、必要書類、保険会社または関係先の判断を混同し、支払いや免除を期待してしまう可能性があります。</w:t>
       </w:r>
     </w:p>
     <w:p>
@@ -2574,12 +2664,12 @@
         <w:pStyle w:val="Heading2"/>
       </w:pPr>
       <w:r>
-        <w:t>Análise</w:t>
-      </w:r>
-    </w:p>
-    <w:p>
-      <w:r>
-        <w:t>O atendimento deve separar objeto segurado, causa do dano, cobertura contratada, franquia, documentos e decisão formal da seguradora.</w:t>
+        <w:t>分析</w:t>
+      </w:r>
+    </w:p>
+    <w:p>
+      <w:r>
+        <w:t>対象物、事故原因、契約条件、免責金額、写真、見積書、領収書、保険会社の確認を分けて整理する必要があります。</w:t>
       </w:r>
     </w:p>
     <w:p>
@@ -2587,12 +2677,12 @@
         <w:pStyle w:val="Heading2"/>
       </w:pPr>
       <w:r>
-        <w:t>Orientação ao corretor</w:t>
-      </w:r>
-    </w:p>
-    <w:p>
-      <w:r>
-        <w:t>Confirmar contrato, endereço segurado, data do evento, fotos, documentos disponíveis e diferença entre explicação geral e análise oficial.</w:t>
+        <w:t>募集人への対応方針</w:t>
+      </w:r>
+    </w:p>
+    <w:p>
+      <w:r>
+        <w:t>火災保険の補償、対象物、事故原因、免責金額、必要書類を確認する場面。契約書、保険証券、写真、領収書、管理会社または保険会社からの案内を確認し、一般説明と正式判断を分けて案内します。</w:t>
       </w:r>
     </w:p>
     <w:p>
@@ -2600,12 +2690,22 @@
         <w:pStyle w:val="Heading2"/>
       </w:pPr>
       <w:r>
-        <w:t>Como explicar ao cliente brasileiro</w:t>
-      </w:r>
-    </w:p>
-    <w:p>
-      <w:r>
-        <w:t>Vamos primeiro verificar o que está segurado, qual foi a causa do dano e quais documentos a seguradora precisa analisar.</w:t>
+        <w:t>ブラジル人顧客への説明方法</w:t>
+      </w:r>
+    </w:p>
+    <w:p>
+      <w:r>
+        <w:t>Leitura para pronúncia: ヴァモス プリメイロ ヴェリフィカール オ キ エスタ セグラード クアウ フォイ ア カウザ ド ダノ イ クアイス ドクメントス ア セグラドーラ プレシーザ アナリザール</w:t>
+      </w:r>
+    </w:p>
+    <w:p>
+      <w:r>
+        <w:t>Português brasileiro: Vamos primeiro verificar o que está segurado, qual foi a causa do dano e quais documentos a seguradora precisa analisar.</w:t>
+      </w:r>
+    </w:p>
+    <w:p>
+      <w:r>
+        <w:t>日本語確認用: 契約内容、必要書類、関係先の確認を分けて案内します。</w:t>
       </w:r>
     </w:p>
     <w:p>
@@ -2613,12 +2713,12 @@
         <w:pStyle w:val="Heading2"/>
       </w:pPr>
       <w:r>
-        <w:t>Resultado esperado</w:t>
-      </w:r>
-    </w:p>
-    <w:p>
-      <w:r>
-        <w:t>Cliente entende o próximo passo e evita concluir sozinho que o dano será pago ou recusado.</w:t>
+        <w:t>期待される結果</w:t>
+      </w:r>
+    </w:p>
+    <w:p>
+      <w:r>
+        <w:t>お客様が次に確認すべき書類、連絡先、判断できることと判断できないことを理解する。</w:t>
       </w:r>
     </w:p>
     <w:p>
@@ -2626,12 +2726,12 @@
         <w:pStyle w:val="Heading2"/>
       </w:pPr>
       <w:r>
-        <w:t>Limite comercial/compliance</w:t>
-      </w:r>
-    </w:p>
-    <w:p>
-      <w:r>
-        <w:t>O corretor deve usar este caso como orientação de atendimento, sem prometer aceitação, cobertura, valor de indenização, prazo ou pagamento. A decisão final depende da apólice, causa do sinistro, franquia, exclusões, documentos e avaliação da seguradora.</w:t>
+        <w:t>コンプライアンス上の注意</w:t>
+      </w:r>
+    </w:p>
+    <w:p>
+      <w:r>
+        <w:t>募集人はこのケースを対応方針として使用し、契約成立、補償、支払可否、返金、費用免除、審査結果、保険金額を断定しない。最終判断は契約条件、提出書類、事故原因、関係先および保険会社の確認による。</w:t>
       </w:r>
     </w:p>
     <w:p>
@@ -2639,7 +2739,7 @@
         <w:pStyle w:val="Heading2"/>
       </w:pPr>
       <w:r>
-        <w:t>Termos relacionados</w:t>
+        <w:t>関連用語</w:t>
       </w:r>
     </w:p>
     <w:p>
@@ -2671,7 +2771,7 @@
         <w:pStyle w:val="Heading2"/>
       </w:pPr>
       <w:r>
-        <w:t>FAQs relacionadas</w:t>
+        <w:t>関連FAQ</w:t>
       </w:r>
     </w:p>
     <w:p>
@@ -2703,7 +2803,7 @@
         <w:pStyle w:val="Heading2"/>
       </w:pPr>
       <w:r>
-        <w:t>Diálogos relacionados</w:t>
+        <w:t>関連対話</w:t>
       </w:r>
     </w:p>
     <w:p>
@@ -2719,7 +2819,7 @@
         <w:pStyle w:val="Heading2"/>
       </w:pPr>
       <w:r>
-        <w:t>Referências cruzadas</w:t>
+        <w:t>相互参照</w:t>
       </w:r>
     </w:p>
     <w:p>
@@ -2783,7 +2883,7 @@
         <w:pStyle w:val="Heading2"/>
       </w:pPr>
       <w:r>
-        <w:t>Referências</w:t>
+        <w:t>参考資料</w:t>
       </w:r>
     </w:p>
     <w:p>
@@ -2799,7 +2899,7 @@
         <w:pStyle w:val="Heading2"/>
       </w:pPr>
       <w:r>
-        <w:t>Tags</w:t>
+        <w:t>タグ</w:t>
       </w:r>
     </w:p>
     <w:p>
@@ -2831,7 +2931,7 @@
         <w:pStyle w:val="ListBullet"/>
       </w:pPr>
       <w:r>
-        <w:t>sinistro</w:t>
+        <w:t>japanese-broker</w:t>
       </w:r>
     </w:p>
     <w:p>
@@ -2839,7 +2939,7 @@
         <w:pStyle w:val="Heading2"/>
       </w:pPr>
       <w:r>
-        <w:t>Veja também</w:t>
+        <w:t>関連項目</w:t>
       </w:r>
     </w:p>
     <w:p>
@@ -2855,7 +2955,7 @@
         <w:pStyle w:val="Heading2"/>
       </w:pPr>
       <w:r>
-        <w:t>Histórico de revisão</w:t>
+        <w:t>改訂履歴</w:t>
       </w:r>
     </w:p>
     <w:p>
@@ -2875,6 +2975,11 @@
     </w:p>
     <w:p>
       <w:r>
+        <w:t>| 2026-06-27 | 0.2 | JP-BR Insurance Knowledge Base | Padronização para uso do corretor japonês com explicação em português e leitura em katakana. |</w:t>
+      </w:r>
+    </w:p>
+    <w:p>
+      <w:r>
         <w:br w:type="page"/>
       </w:r>
     </w:p>
@@ -2891,7 +2996,7 @@
         <w:pStyle w:val="Heading2"/>
       </w:pPr>
       <w:r>
-        <w:t>Controle</w:t>
+        <w:t>管理情報</w:t>
       </w:r>
     </w:p>
     <w:p>
@@ -2899,7 +3004,7 @@
         <w:pStyle w:val="ListBullet"/>
       </w:pPr>
       <w:r>
-        <w:t>Versão: 0.1</w:t>
+        <w:t>Versão: 0.2</w:t>
       </w:r>
     </w:p>
     <w:p>
@@ -2923,7 +3028,7 @@
         <w:pStyle w:val="ListBullet"/>
       </w:pPr>
       <w:r>
-        <w:t>Histórico: Criação inicial.</w:t>
+        <w:t>Histórico: Criação inicial; padronização para uso do corretor japonês com explicação em português e leitura em katakana.</w:t>
       </w:r>
     </w:p>
     <w:p>
@@ -2931,7 +3036,7 @@
         <w:pStyle w:val="Heading2"/>
       </w:pPr>
       <w:r>
-        <w:t>Código</w:t>
+        <w:t>コード</w:t>
       </w:r>
     </w:p>
     <w:p>
@@ -2944,7 +3049,7 @@
         <w:pStyle w:val="Heading2"/>
       </w:pPr>
       <w:r>
-        <w:t>Produto ou categoria</w:t>
+        <w:t>商品・カテゴリー</w:t>
       </w:r>
     </w:p>
     <w:p>
@@ -2957,12 +3062,12 @@
         <w:pStyle w:val="Heading2"/>
       </w:pPr>
       <w:r>
-        <w:t>Situação</w:t>
-      </w:r>
-    </w:p>
-    <w:p>
-      <w:r>
-        <w:t>Vazamento causa dano ao apartamento de baixo.</w:t>
+        <w:t>状況</w:t>
+      </w:r>
+    </w:p>
+    <w:p>
+      <w:r>
+        <w:t>火災保険に関する具体的な相談ケース。お客様が補償範囲、事故原因、必要書類、支払可否について確認している場面。</w:t>
       </w:r>
     </w:p>
     <w:p>
@@ -2970,12 +3075,12 @@
         <w:pStyle w:val="Heading2"/>
       </w:pPr>
       <w:r>
-        <w:t>Problema</w:t>
-      </w:r>
-    </w:p>
-    <w:p>
-      <w:r>
-        <w:t>Cliente pode interpretar cobertura, franquia, objeto segurado ou documentos de forma incorreta e criar expectativa de pagamento automático.</w:t>
+        <w:t>問題</w:t>
+      </w:r>
+    </w:p>
+    <w:p>
+      <w:r>
+        <w:t>お客様が契約上の義務、補償範囲、費用負担、必要書類、保険会社または関係先の判断を混同し、支払いや免除を期待してしまう可能性があります。</w:t>
       </w:r>
     </w:p>
     <w:p>
@@ -2983,12 +3088,12 @@
         <w:pStyle w:val="Heading2"/>
       </w:pPr>
       <w:r>
-        <w:t>Análise</w:t>
-      </w:r>
-    </w:p>
-    <w:p>
-      <w:r>
-        <w:t>O atendimento deve separar objeto segurado, causa do dano, cobertura contratada, franquia, documentos e decisão formal da seguradora.</w:t>
+        <w:t>分析</w:t>
+      </w:r>
+    </w:p>
+    <w:p>
+      <w:r>
+        <w:t>対象物、事故原因、契約条件、免責金額、写真、見積書、領収書、保険会社の確認を分けて整理する必要があります。</w:t>
       </w:r>
     </w:p>
     <w:p>
@@ -2996,12 +3101,12 @@
         <w:pStyle w:val="Heading2"/>
       </w:pPr>
       <w:r>
-        <w:t>Orientação ao corretor</w:t>
-      </w:r>
-    </w:p>
-    <w:p>
-      <w:r>
-        <w:t>Confirmar contrato, endereço segurado, data do evento, fotos, documentos disponíveis e diferença entre explicação geral e análise oficial.</w:t>
+        <w:t>募集人への対応方針</w:t>
+      </w:r>
+    </w:p>
+    <w:p>
+      <w:r>
+        <w:t>火災保険の補償、対象物、事故原因、免責金額、必要書類を確認する場面。契約書、保険証券、写真、領収書、管理会社または保険会社からの案内を確認し、一般説明と正式判断を分けて案内します。</w:t>
       </w:r>
     </w:p>
     <w:p>
@@ -3009,12 +3114,22 @@
         <w:pStyle w:val="Heading2"/>
       </w:pPr>
       <w:r>
-        <w:t>Como explicar ao cliente brasileiro</w:t>
-      </w:r>
-    </w:p>
-    <w:p>
-      <w:r>
-        <w:t>Vamos primeiro verificar o que está segurado, qual foi a causa do dano e quais documentos a seguradora precisa analisar.</w:t>
+        <w:t>ブラジル人顧客への説明方法</w:t>
+      </w:r>
+    </w:p>
+    <w:p>
+      <w:r>
+        <w:t>Leitura para pronúncia: ヴァモス プリメイロ ヴェリフィカール オ キ エスタ セグラード クアウ フォイ ア カウザ ド ダノ イ クアイス ドクメントス ア セグラドーラ プレシーザ アナリザール</w:t>
+      </w:r>
+    </w:p>
+    <w:p>
+      <w:r>
+        <w:t>Português brasileiro: Vamos primeiro verificar o que está segurado, qual foi a causa do dano e quais documentos a seguradora precisa analisar.</w:t>
+      </w:r>
+    </w:p>
+    <w:p>
+      <w:r>
+        <w:t>日本語確認用: 契約内容、必要書類、関係先の確認を分けて案内します。</w:t>
       </w:r>
     </w:p>
     <w:p>
@@ -3022,12 +3137,12 @@
         <w:pStyle w:val="Heading2"/>
       </w:pPr>
       <w:r>
-        <w:t>Resultado esperado</w:t>
-      </w:r>
-    </w:p>
-    <w:p>
-      <w:r>
-        <w:t>Cliente entende o próximo passo e evita concluir sozinho que o dano será pago ou recusado.</w:t>
+        <w:t>期待される結果</w:t>
+      </w:r>
+    </w:p>
+    <w:p>
+      <w:r>
+        <w:t>お客様が次に確認すべき書類、連絡先、判断できることと判断できないことを理解する。</w:t>
       </w:r>
     </w:p>
     <w:p>
@@ -3035,12 +3150,12 @@
         <w:pStyle w:val="Heading2"/>
       </w:pPr>
       <w:r>
-        <w:t>Limite comercial/compliance</w:t>
-      </w:r>
-    </w:p>
-    <w:p>
-      <w:r>
-        <w:t>O corretor deve usar este caso como orientação de atendimento, sem prometer aceitação, cobertura, valor de indenização, prazo ou pagamento. A decisão final depende da apólice, causa do sinistro, franquia, exclusões, documentos e avaliação da seguradora.</w:t>
+        <w:t>コンプライアンス上の注意</w:t>
+      </w:r>
+    </w:p>
+    <w:p>
+      <w:r>
+        <w:t>募集人はこのケースを対応方針として使用し、契約成立、補償、支払可否、返金、費用免除、審査結果、保険金額を断定しない。最終判断は契約条件、提出書類、事故原因、関係先および保険会社の確認による。</w:t>
       </w:r>
     </w:p>
     <w:p>
@@ -3048,7 +3163,7 @@
         <w:pStyle w:val="Heading2"/>
       </w:pPr>
       <w:r>
-        <w:t>Termos relacionados</w:t>
+        <w:t>関連用語</w:t>
       </w:r>
     </w:p>
     <w:p>
@@ -3080,7 +3195,7 @@
         <w:pStyle w:val="Heading2"/>
       </w:pPr>
       <w:r>
-        <w:t>FAQs relacionadas</w:t>
+        <w:t>関連FAQ</w:t>
       </w:r>
     </w:p>
     <w:p>
@@ -3112,7 +3227,7 @@
         <w:pStyle w:val="Heading2"/>
       </w:pPr>
       <w:r>
-        <w:t>Diálogos relacionados</w:t>
+        <w:t>関連対話</w:t>
       </w:r>
     </w:p>
     <w:p>
@@ -3128,7 +3243,7 @@
         <w:pStyle w:val="Heading2"/>
       </w:pPr>
       <w:r>
-        <w:t>Referências cruzadas</w:t>
+        <w:t>相互参照</w:t>
       </w:r>
     </w:p>
     <w:p>
@@ -3192,7 +3307,7 @@
         <w:pStyle w:val="Heading2"/>
       </w:pPr>
       <w:r>
-        <w:t>Referências</w:t>
+        <w:t>参考資料</w:t>
       </w:r>
     </w:p>
     <w:p>
@@ -3208,7 +3323,7 @@
         <w:pStyle w:val="Heading2"/>
       </w:pPr>
       <w:r>
-        <w:t>Tags</w:t>
+        <w:t>タグ</w:t>
       </w:r>
     </w:p>
     <w:p>
@@ -3240,7 +3355,7 @@
         <w:pStyle w:val="ListBullet"/>
       </w:pPr>
       <w:r>
-        <w:t>sinistro</w:t>
+        <w:t>japanese-broker</w:t>
       </w:r>
     </w:p>
     <w:p>
@@ -3248,7 +3363,7 @@
         <w:pStyle w:val="Heading2"/>
       </w:pPr>
       <w:r>
-        <w:t>Veja também</w:t>
+        <w:t>関連項目</w:t>
       </w:r>
     </w:p>
     <w:p>
@@ -3264,7 +3379,7 @@
         <w:pStyle w:val="Heading2"/>
       </w:pPr>
       <w:r>
-        <w:t>Histórico de revisão</w:t>
+        <w:t>改訂履歴</w:t>
       </w:r>
     </w:p>
     <w:p>
@@ -3280,6 +3395,11 @@
     <w:p>
       <w:r>
         <w:t>| 2026-06-27 | 0.1 | JP-BR Insurance Knowledge Base | Criação inicial. |</w:t>
+      </w:r>
+    </w:p>
+    <w:p>
+      <w:r>
+        <w:t>| 2026-06-27 | 0.2 | JP-BR Insurance Knowledge Base | Padronização para uso do corretor japonês com explicação em português e leitura em katakana. |</w:t>
       </w:r>
     </w:p>
     <w:sectPr>

</xml_diff>

<commit_message>
Make customer Portuguese explicit across broker materials
</commit_message>
<xml_diff>
--- a/18_DOCX/FIRE_CASES_0001_0008.docx
+++ b/18_DOCX/FIRE_CASES_0001_0008.docx
@@ -151,16 +151,16 @@
     </w:p>
     <w:p>
       <w:r>
-        <w:t>Leitura para pronúncia: ヴァモス プリメイロ ヴェリフィカール オ キ エスタ セグラード クアウ フォイ ア カウザ ド ダノ イ クアイス ドクメントス ア セグラドーラ プレシーザ アナリザール</w:t>
-      </w:r>
-    </w:p>
-    <w:p>
-      <w:r>
         <w:t>Português brasileiro: Vamos primeiro verificar o que está segurado, qual foi a causa do dano e quais documentos a seguradora precisa analisar.</w:t>
       </w:r>
     </w:p>
     <w:p>
       <w:r>
+        <w:t>カタカナ読み: ヴァモス プリメイロ ヴェリフィカール オ キ エスタ セグラード クアウ フォイ ア カウザ ド ダノ イ クアイス ドクメントス ア セグラドーラ プレシーザ アナリザール</w:t>
+      </w:r>
+    </w:p>
+    <w:p>
+      <w:r>
         <w:t>日本語確認用: 契約内容、必要書類、関係先の確認を分けて案内します。</w:t>
       </w:r>
     </w:p>
@@ -575,16 +575,16 @@
     </w:p>
     <w:p>
       <w:r>
-        <w:t>Leitura para pronúncia: ヴァモス プリメイロ ヴェリフィカール オ キ エスタ セグラード クアウ フォイ ア カウザ ド ダノ イ クアイス ドクメントス ア セグラドーラ プレシーザ アナリザール</w:t>
-      </w:r>
-    </w:p>
-    <w:p>
-      <w:r>
         <w:t>Português brasileiro: Vamos primeiro verificar o que está segurado, qual foi a causa do dano e quais documentos a seguradora precisa analisar.</w:t>
       </w:r>
     </w:p>
     <w:p>
       <w:r>
+        <w:t>カタカナ読み: ヴァモス プリメイロ ヴェリフィカール オ キ エスタ セグラード クアウ フォイ ア カウザ ド ダノ イ クアイス ドクメントス ア セグラドーラ プレシーザ アナリザール</w:t>
+      </w:r>
+    </w:p>
+    <w:p>
+      <w:r>
         <w:t>日本語確認用: 契約内容、必要書類、関係先の確認を分けて案内します。</w:t>
       </w:r>
     </w:p>
@@ -999,16 +999,16 @@
     </w:p>
     <w:p>
       <w:r>
-        <w:t>Leitura para pronúncia: ヴァモス プリメイロ ヴェリフィカール オ キ エスタ セグラード クアウ フォイ ア カウザ ド ダノ イ クアイス ドクメントス ア セグラドーラ プレシーザ アナリザール</w:t>
-      </w:r>
-    </w:p>
-    <w:p>
-      <w:r>
         <w:t>Português brasileiro: Vamos primeiro verificar o que está segurado, qual foi a causa do dano e quais documentos a seguradora precisa analisar.</w:t>
       </w:r>
     </w:p>
     <w:p>
       <w:r>
+        <w:t>カタカナ読み: ヴァモス プリメイロ ヴェリフィカール オ キ エスタ セグラード クアウ フォイ ア カウザ ド ダノ イ クアイス ドクメントス ア セグラドーラ プレシーザ アナリザール</w:t>
+      </w:r>
+    </w:p>
+    <w:p>
+      <w:r>
         <w:t>日本語確認用: 契約内容、必要書類、関係先の確認を分けて案内します。</w:t>
       </w:r>
     </w:p>
@@ -1423,16 +1423,16 @@
     </w:p>
     <w:p>
       <w:r>
-        <w:t>Leitura para pronúncia: ヴァモス プリメイロ ヴェリフィカール オ キ エスタ セグラード クアウ フォイ ア カウザ ド ダノ イ クアイス ドクメントス ア セグラドーラ プレシーザ アナリザール</w:t>
-      </w:r>
-    </w:p>
-    <w:p>
-      <w:r>
         <w:t>Português brasileiro: Vamos primeiro verificar o que está segurado, qual foi a causa do dano e quais documentos a seguradora precisa analisar.</w:t>
       </w:r>
     </w:p>
     <w:p>
       <w:r>
+        <w:t>カタカナ読み: ヴァモス プリメイロ ヴェリフィカール オ キ エスタ セグラード クアウ フォイ ア カウザ ド ダノ イ クアイス ドクメントス ア セグラドーラ プレシーザ アナリザール</w:t>
+      </w:r>
+    </w:p>
+    <w:p>
+      <w:r>
         <w:t>日本語確認用: 契約内容、必要書類、関係先の確認を分けて案内します。</w:t>
       </w:r>
     </w:p>
@@ -1847,16 +1847,16 @@
     </w:p>
     <w:p>
       <w:r>
-        <w:t>Leitura para pronúncia: ヴァモス プリメイロ ヴェリフィカール オ キ エスタ セグラード クアウ フォイ ア カウザ ド ダノ イ クアイス ドクメントス ア セグラドーラ プレシーザ アナリザール</w:t>
-      </w:r>
-    </w:p>
-    <w:p>
-      <w:r>
         <w:t>Português brasileiro: Vamos primeiro verificar o que está segurado, qual foi a causa do dano e quais documentos a seguradora precisa analisar.</w:t>
       </w:r>
     </w:p>
     <w:p>
       <w:r>
+        <w:t>カタカナ読み: ヴァモス プリメイロ ヴェリフィカール オ キ エスタ セグラード クアウ フォイ ア カウザ ド ダノ イ クアイス ドクメントス ア セグラドーラ プレシーザ アナリザール</w:t>
+      </w:r>
+    </w:p>
+    <w:p>
+      <w:r>
         <w:t>日本語確認用: 契約内容、必要書類、関係先の確認を分けて案内します。</w:t>
       </w:r>
     </w:p>
@@ -2271,16 +2271,16 @@
     </w:p>
     <w:p>
       <w:r>
-        <w:t>Leitura para pronúncia: ヴァモス プリメイロ ヴェリフィカール オ キ エスタ セグラード クアウ フォイ ア カウザ ド ダノ イ クアイス ドクメントス ア セグラドーラ プレシーザ アナリザール</w:t>
-      </w:r>
-    </w:p>
-    <w:p>
-      <w:r>
         <w:t>Português brasileiro: Vamos primeiro verificar o que está segurado, qual foi a causa do dano e quais documentos a seguradora precisa analisar.</w:t>
       </w:r>
     </w:p>
     <w:p>
       <w:r>
+        <w:t>カタカナ読み: ヴァモス プリメイロ ヴェリフィカール オ キ エスタ セグラード クアウ フォイ ア カウザ ド ダノ イ クアイス ドクメントス ア セグラドーラ プレシーザ アナリザール</w:t>
+      </w:r>
+    </w:p>
+    <w:p>
+      <w:r>
         <w:t>日本語確認用: 契約内容、必要書類、関係先の確認を分けて案内します。</w:t>
       </w:r>
     </w:p>
@@ -2695,16 +2695,16 @@
     </w:p>
     <w:p>
       <w:r>
-        <w:t>Leitura para pronúncia: ヴァモス プリメイロ ヴェリフィカール オ キ エスタ セグラード クアウ フォイ ア カウザ ド ダノ イ クアイス ドクメントス ア セグラドーラ プレシーザ アナリザール</w:t>
-      </w:r>
-    </w:p>
-    <w:p>
-      <w:r>
         <w:t>Português brasileiro: Vamos primeiro verificar o que está segurado, qual foi a causa do dano e quais documentos a seguradora precisa analisar.</w:t>
       </w:r>
     </w:p>
     <w:p>
       <w:r>
+        <w:t>カタカナ読み: ヴァモス プリメイロ ヴェリフィカール オ キ エスタ セグラード クアウ フォイ ア カウザ ド ダノ イ クアイス ドクメントス ア セグラドーラ プレシーザ アナリザール</w:t>
+      </w:r>
+    </w:p>
+    <w:p>
+      <w:r>
         <w:t>日本語確認用: 契約内容、必要書類、関係先の確認を分けて案内します。</w:t>
       </w:r>
     </w:p>
@@ -3119,12 +3119,12 @@
     </w:p>
     <w:p>
       <w:r>
-        <w:t>Leitura para pronúncia: ヴァモス プリメイロ ヴェリフィカール オ キ エスタ セグラード クアウ フォイ ア カウザ ド ダノ イ クアイス ドクメントス ア セグラドーラ プレシーザ アナリザール</w:t>
-      </w:r>
-    </w:p>
-    <w:p>
-      <w:r>
         <w:t>Português brasileiro: Vamos primeiro verificar o que está segurado, qual foi a causa do dano e quais documentos a seguradora precisa analisar.</w:t>
+      </w:r>
+    </w:p>
+    <w:p>
+      <w:r>
+        <w:t>カタカナ読み: ヴァモス プリメイロ ヴェリフィカール オ キ エスタ セグラード クアウ フォイ ア カウザ ド ダノ イ クアイス ドクメントス ア セグラドーラ プレシーザ アナリザール</w:t>
       </w:r>
     </w:p>
     <w:p>

</xml_diff>